<commit_message>
Deployed ca497e2 with MkDocs version: 1.4.2
</commit_message>
<xml_diff>
--- a/openEHR Practical Modelling.docx
+++ b/openEHR Practical Modelling.docx
@@ -1,6 +1,6 @@
 
 <file path=word/document.xml><?xml version="1.0" encoding="utf-8"?>
-<w:document xmlns:wpc="http://schemas.microsoft.com/office/word/2010/wordprocessingCanvas" xmlns:cx="http://schemas.microsoft.com/office/drawing/2014/chartex" xmlns:cx1="http://schemas.microsoft.com/office/drawing/2015/9/8/chartex" xmlns:cx2="http://schemas.microsoft.com/office/drawing/2015/10/21/chartex" xmlns:cx3="http://schemas.microsoft.com/office/drawing/2016/5/9/chartex" xmlns:cx4="http://schemas.microsoft.com/office/drawing/2016/5/10/chartex" xmlns:cx5="http://schemas.microsoft.com/office/drawing/2016/5/11/chartex" xmlns:cx6="http://schemas.microsoft.com/office/drawing/2016/5/12/chartex" xmlns:cx7="http://schemas.microsoft.com/office/drawing/2016/5/13/chartex" xmlns:cx8="http://schemas.microsoft.com/office/drawing/2016/5/14/chartex" xmlns:mc="http://schemas.openxmlformats.org/markup-compatibility/2006" xmlns:aink="http://schemas.microsoft.com/office/drawing/2016/ink" xmlns:am3d="http://schemas.microsoft.com/office/drawing/2017/model3d" xmlns:o="urn:schemas-microsoft-com:office:office" xmlns:r="http://schemas.openxmlformats.org/officeDocument/2006/relationships" xmlns:m="http://schemas.openxmlformats.org/officeDocument/2006/math" xmlns:v="urn:schemas-microsoft-com:vml" xmlns:wp14="http://schemas.microsoft.com/office/word/2010/wordprocessingDrawing" xmlns:wp="http://schemas.openxmlformats.org/drawingml/2006/wordprocessingDrawing" xmlns:w10="urn:schemas-microsoft-com:office:word" xmlns:w="http://schemas.openxmlformats.org/wordprocessingml/2006/main" xmlns:w14="http://schemas.microsoft.com/office/word/2010/wordml" xmlns:w15="http://schemas.microsoft.com/office/word/2012/wordml" xmlns:w16cex="http://schemas.microsoft.com/office/word/2018/wordml/cex" xmlns:w16cid="http://schemas.microsoft.com/office/word/2016/wordml/cid" xmlns:w16="http://schemas.microsoft.com/office/word/2018/wordml" xmlns:w16se="http://schemas.microsoft.com/office/word/2015/wordml/symex" xmlns:wpg="http://schemas.microsoft.com/office/word/2010/wordprocessingGroup" xmlns:wpi="http://schemas.microsoft.com/office/word/2010/wordprocessingInk" xmlns:wne="http://schemas.microsoft.com/office/word/2006/wordml" xmlns:wps="http://schemas.microsoft.com/office/word/2010/wordprocessingShape" mc:Ignorable="w14 w15 w16se w16cid w16 w16cex wp14">
+<w:document xmlns:wpc="http://schemas.microsoft.com/office/word/2010/wordprocessingCanvas" xmlns:cx="http://schemas.microsoft.com/office/drawing/2014/chartex" xmlns:cx1="http://schemas.microsoft.com/office/drawing/2015/9/8/chartex" xmlns:cx2="http://schemas.microsoft.com/office/drawing/2015/10/21/chartex" xmlns:cx3="http://schemas.microsoft.com/office/drawing/2016/5/9/chartex" xmlns:cx4="http://schemas.microsoft.com/office/drawing/2016/5/10/chartex" xmlns:cx5="http://schemas.microsoft.com/office/drawing/2016/5/11/chartex" xmlns:cx6="http://schemas.microsoft.com/office/drawing/2016/5/12/chartex" xmlns:cx7="http://schemas.microsoft.com/office/drawing/2016/5/13/chartex" xmlns:cx8="http://schemas.microsoft.com/office/drawing/2016/5/14/chartex" xmlns:mc="http://schemas.openxmlformats.org/markup-compatibility/2006" xmlns:aink="http://schemas.microsoft.com/office/drawing/2016/ink" xmlns:am3d="http://schemas.microsoft.com/office/drawing/2017/model3d" xmlns:o="urn:schemas-microsoft-com:office:office" xmlns:oel="http://schemas.microsoft.com/office/2019/extlst" xmlns:r="http://schemas.openxmlformats.org/officeDocument/2006/relationships" xmlns:m="http://schemas.openxmlformats.org/officeDocument/2006/math" xmlns:v="urn:schemas-microsoft-com:vml" xmlns:wp14="http://schemas.microsoft.com/office/word/2010/wordprocessingDrawing" xmlns:wp="http://schemas.openxmlformats.org/drawingml/2006/wordprocessingDrawing" xmlns:w10="urn:schemas-microsoft-com:office:word" xmlns:w="http://schemas.openxmlformats.org/wordprocessingml/2006/main" xmlns:w14="http://schemas.microsoft.com/office/word/2010/wordml" xmlns:w15="http://schemas.microsoft.com/office/word/2012/wordml" xmlns:w16cex="http://schemas.microsoft.com/office/word/2018/wordml/cex" xmlns:w16cid="http://schemas.microsoft.com/office/word/2016/wordml/cid" xmlns:w16="http://schemas.microsoft.com/office/word/2018/wordml" xmlns:w16sdtdh="http://schemas.microsoft.com/office/word/2020/wordml/sdtdatahash" xmlns:w16se="http://schemas.microsoft.com/office/word/2015/wordml/symex" xmlns:wpg="http://schemas.microsoft.com/office/word/2010/wordprocessingGroup" xmlns:wpi="http://schemas.microsoft.com/office/word/2010/wordprocessingInk" xmlns:wne="http://schemas.microsoft.com/office/word/2006/wordml" xmlns:wps="http://schemas.microsoft.com/office/word/2010/wordprocessingShape" mc:Ignorable="w14 w15 w16se w16cid w16 w16cex w16sdtdh wp14">
   <w:body>
     <w:p>
       <w:pPr>
@@ -784,10 +784,8 @@
       <w:r>
         <w:tab/>
       </w:r>
-    </w:p>
-    <w:p>
-      <w:r>
-        <w:tab/>
+      <w:r>
+        <w:t xml:space="preserve">             </w:t>
       </w:r>
       <w:r>
         <w:sym w:font="Symbol" w:char="F07F"/>
@@ -916,6 +914,93 @@
       </w:r>
     </w:p>
     <w:p/>
+    <w:p>
+      <w:pPr>
+        <w:rPr>
+          <w:color w:val="FF0000"/>
+        </w:rPr>
+      </w:pPr>
+      <w:r>
+        <w:rPr>
+          <w:color w:val="FF0000"/>
+        </w:rPr>
+        <w:br w:type="page"/>
+      </w:r>
+    </w:p>
+    <w:p>
+      <w:pPr>
+        <w:pStyle w:val="Title"/>
+        <w:rPr>
+          <w:lang w:eastAsia="en-GB"/>
+        </w:rPr>
+      </w:pPr>
+      <w:r>
+        <w:rPr>
+          <w:lang w:eastAsia="en-GB"/>
+        </w:rPr>
+        <w:lastRenderedPageBreak/>
+        <w:t xml:space="preserve">C. </w:t>
+      </w:r>
+      <w:r>
+        <w:rPr>
+          <w:rFonts w:eastAsia="Times New Roman"/>
+          <w:lang w:eastAsia="en-GB"/>
+        </w:rPr>
+        <w:t>'Form-centric' to 'Patient-centric'?</w:t>
+      </w:r>
+    </w:p>
+    <w:p>
+      <w:pPr>
+        <w:rPr>
+          <w:lang w:eastAsia="en-GB"/>
+        </w:rPr>
+      </w:pPr>
+      <w:r>
+        <w:rPr>
+          <w:color w:val="C3E88D"/>
+          <w:lang w:eastAsia="en-GB"/>
+        </w:rPr>
+        <w:br/>
+      </w:r>
+      <w:r>
+        <w:rPr>
+          <w:lang w:eastAsia="en-GB"/>
+        </w:rPr>
+        <w:t>T</w:t>
+      </w:r>
+      <w:r>
+        <w:rPr>
+          <w:lang w:eastAsia="en-GB"/>
+        </w:rPr>
+        <w:t>hink about how we might re-organise this information into multiple templates to make it more 'patient-centric' and reduce the data entry burden for the nurse (and patient!)</w:t>
+      </w:r>
+      <w:r>
+        <w:rPr>
+          <w:lang w:eastAsia="en-GB"/>
+        </w:rPr>
+        <w:br/>
+      </w:r>
+      <w:r>
+        <w:rPr>
+          <w:lang w:eastAsia="en-GB"/>
+        </w:rPr>
+        <w:br/>
+        <w:t>What information is about the patient 'globally' versus what is about the immediate clinical context.</w:t>
+      </w:r>
+      <w:r>
+        <w:rPr>
+          <w:lang w:eastAsia="en-GB"/>
+        </w:rPr>
+        <w:br/>
+      </w:r>
+      <w:r>
+        <w:rPr>
+          <w:lang w:eastAsia="en-GB"/>
+        </w:rPr>
+        <w:br/>
+        <w:t>List any parts of this dataset that might be handled more globally for the patient.</w:t>
+      </w:r>
+    </w:p>
     <w:sectPr>
       <w:pgSz w:w="11900" w:h="16840"/>
       <w:pgMar w:top="1440" w:right="1440" w:bottom="1440" w:left="1440" w:header="720" w:footer="720" w:gutter="0"/>
@@ -927,7 +1012,7 @@
 </file>
 
 <file path=word/numbering.xml><?xml version="1.0" encoding="utf-8"?>
-<w:numbering xmlns:wpc="http://schemas.microsoft.com/office/word/2010/wordprocessingCanvas" xmlns:cx="http://schemas.microsoft.com/office/drawing/2014/chartex" xmlns:cx1="http://schemas.microsoft.com/office/drawing/2015/9/8/chartex" xmlns:cx2="http://schemas.microsoft.com/office/drawing/2015/10/21/chartex" xmlns:cx3="http://schemas.microsoft.com/office/drawing/2016/5/9/chartex" xmlns:cx4="http://schemas.microsoft.com/office/drawing/2016/5/10/chartex" xmlns:cx5="http://schemas.microsoft.com/office/drawing/2016/5/11/chartex" xmlns:cx6="http://schemas.microsoft.com/office/drawing/2016/5/12/chartex" xmlns:cx7="http://schemas.microsoft.com/office/drawing/2016/5/13/chartex" xmlns:cx8="http://schemas.microsoft.com/office/drawing/2016/5/14/chartex" xmlns:mc="http://schemas.openxmlformats.org/markup-compatibility/2006" xmlns:aink="http://schemas.microsoft.com/office/drawing/2016/ink" xmlns:am3d="http://schemas.microsoft.com/office/drawing/2017/model3d" xmlns:o="urn:schemas-microsoft-com:office:office" xmlns:r="http://schemas.openxmlformats.org/officeDocument/2006/relationships" xmlns:m="http://schemas.openxmlformats.org/officeDocument/2006/math" xmlns:v="urn:schemas-microsoft-com:vml" xmlns:wp14="http://schemas.microsoft.com/office/word/2010/wordprocessingDrawing" xmlns:wp="http://schemas.openxmlformats.org/drawingml/2006/wordprocessingDrawing" xmlns:w10="urn:schemas-microsoft-com:office:word" xmlns:w="http://schemas.openxmlformats.org/wordprocessingml/2006/main" xmlns:w14="http://schemas.microsoft.com/office/word/2010/wordml" xmlns:w15="http://schemas.microsoft.com/office/word/2012/wordml" xmlns:w16cex="http://schemas.microsoft.com/office/word/2018/wordml/cex" xmlns:w16cid="http://schemas.microsoft.com/office/word/2016/wordml/cid" xmlns:w16="http://schemas.microsoft.com/office/word/2018/wordml" xmlns:w16se="http://schemas.microsoft.com/office/word/2015/wordml/symex" xmlns:wpg="http://schemas.microsoft.com/office/word/2010/wordprocessingGroup" xmlns:wpi="http://schemas.microsoft.com/office/word/2010/wordprocessingInk" xmlns:wne="http://schemas.microsoft.com/office/word/2006/wordml" xmlns:wps="http://schemas.microsoft.com/office/word/2010/wordprocessingShape" mc:Ignorable="w14 w15 w16se w16cid w16 w16cex wp14">
+<w:numbering xmlns:wpc="http://schemas.microsoft.com/office/word/2010/wordprocessingCanvas" xmlns:cx="http://schemas.microsoft.com/office/drawing/2014/chartex" xmlns:cx1="http://schemas.microsoft.com/office/drawing/2015/9/8/chartex" xmlns:cx2="http://schemas.microsoft.com/office/drawing/2015/10/21/chartex" xmlns:cx3="http://schemas.microsoft.com/office/drawing/2016/5/9/chartex" xmlns:cx4="http://schemas.microsoft.com/office/drawing/2016/5/10/chartex" xmlns:cx5="http://schemas.microsoft.com/office/drawing/2016/5/11/chartex" xmlns:cx6="http://schemas.microsoft.com/office/drawing/2016/5/12/chartex" xmlns:cx7="http://schemas.microsoft.com/office/drawing/2016/5/13/chartex" xmlns:cx8="http://schemas.microsoft.com/office/drawing/2016/5/14/chartex" xmlns:mc="http://schemas.openxmlformats.org/markup-compatibility/2006" xmlns:aink="http://schemas.microsoft.com/office/drawing/2016/ink" xmlns:am3d="http://schemas.microsoft.com/office/drawing/2017/model3d" xmlns:o="urn:schemas-microsoft-com:office:office" xmlns:oel="http://schemas.microsoft.com/office/2019/extlst" xmlns:r="http://schemas.openxmlformats.org/officeDocument/2006/relationships" xmlns:m="http://schemas.openxmlformats.org/officeDocument/2006/math" xmlns:v="urn:schemas-microsoft-com:vml" xmlns:wp14="http://schemas.microsoft.com/office/word/2010/wordprocessingDrawing" xmlns:wp="http://schemas.openxmlformats.org/drawingml/2006/wordprocessingDrawing" xmlns:w10="urn:schemas-microsoft-com:office:word" xmlns:w="http://schemas.openxmlformats.org/wordprocessingml/2006/main" xmlns:w14="http://schemas.microsoft.com/office/word/2010/wordml" xmlns:w15="http://schemas.microsoft.com/office/word/2012/wordml" xmlns:w16cex="http://schemas.microsoft.com/office/word/2018/wordml/cex" xmlns:w16cid="http://schemas.microsoft.com/office/word/2016/wordml/cid" xmlns:w16="http://schemas.microsoft.com/office/word/2018/wordml" xmlns:w16sdtdh="http://schemas.microsoft.com/office/word/2020/wordml/sdtdatahash" xmlns:w16se="http://schemas.microsoft.com/office/word/2015/wordml/symex" xmlns:wpg="http://schemas.microsoft.com/office/word/2010/wordprocessingGroup" xmlns:wpi="http://schemas.microsoft.com/office/word/2010/wordprocessingInk" xmlns:wne="http://schemas.microsoft.com/office/word/2006/wordml" xmlns:wps="http://schemas.microsoft.com/office/word/2010/wordprocessingShape" mc:Ignorable="w14 w15 w16se w16cid w16 w16cex w16sdtdh wp14">
   <w:abstractNum w:abstractNumId="0" w15:restartNumberingAfterBreak="0">
     <w:nsid w:val="FFFFFF7C"/>
     <w:multiLevelType w:val="singleLevel"/>
@@ -1583,56 +1668,56 @@
       </w:pPr>
     </w:lvl>
   </w:abstractNum>
-  <w:num w:numId="1">
+  <w:num w:numId="1" w16cid:durableId="1851484841">
     <w:abstractNumId w:val="0"/>
   </w:num>
-  <w:num w:numId="2">
+  <w:num w:numId="2" w16cid:durableId="704211995">
     <w:abstractNumId w:val="1"/>
   </w:num>
-  <w:num w:numId="3">
+  <w:num w:numId="3" w16cid:durableId="798687851">
     <w:abstractNumId w:val="2"/>
   </w:num>
-  <w:num w:numId="4">
+  <w:num w:numId="4" w16cid:durableId="187454353">
     <w:abstractNumId w:val="3"/>
   </w:num>
-  <w:num w:numId="5">
+  <w:num w:numId="5" w16cid:durableId="939679165">
     <w:abstractNumId w:val="8"/>
   </w:num>
-  <w:num w:numId="6">
+  <w:num w:numId="6" w16cid:durableId="1637449635">
     <w:abstractNumId w:val="4"/>
   </w:num>
-  <w:num w:numId="7">
+  <w:num w:numId="7" w16cid:durableId="959649482">
     <w:abstractNumId w:val="5"/>
   </w:num>
-  <w:num w:numId="8">
+  <w:num w:numId="8" w16cid:durableId="1303661237">
     <w:abstractNumId w:val="6"/>
   </w:num>
-  <w:num w:numId="9">
+  <w:num w:numId="9" w16cid:durableId="1050693816">
     <w:abstractNumId w:val="7"/>
   </w:num>
-  <w:num w:numId="10">
+  <w:num w:numId="10" w16cid:durableId="1669864861">
     <w:abstractNumId w:val="9"/>
   </w:num>
-  <w:num w:numId="11">
+  <w:num w:numId="11" w16cid:durableId="518156235">
     <w:abstractNumId w:val="13"/>
   </w:num>
-  <w:num w:numId="12">
+  <w:num w:numId="12" w16cid:durableId="2140344486">
     <w:abstractNumId w:val="12"/>
   </w:num>
-  <w:num w:numId="13">
+  <w:num w:numId="13" w16cid:durableId="2069306424">
     <w:abstractNumId w:val="14"/>
   </w:num>
-  <w:num w:numId="14">
+  <w:num w:numId="14" w16cid:durableId="1981837298">
     <w:abstractNumId w:val="11"/>
   </w:num>
-  <w:num w:numId="15">
+  <w:num w:numId="15" w16cid:durableId="169755838">
     <w:abstractNumId w:val="10"/>
   </w:num>
 </w:numbering>
 </file>
 
 <file path=word/styles.xml><?xml version="1.0" encoding="utf-8"?>
-<w:styles xmlns:mc="http://schemas.openxmlformats.org/markup-compatibility/2006" xmlns:r="http://schemas.openxmlformats.org/officeDocument/2006/relationships" xmlns:w="http://schemas.openxmlformats.org/wordprocessingml/2006/main" xmlns:w14="http://schemas.microsoft.com/office/word/2010/wordml" xmlns:w15="http://schemas.microsoft.com/office/word/2012/wordml" xmlns:w16cex="http://schemas.microsoft.com/office/word/2018/wordml/cex" xmlns:w16cid="http://schemas.microsoft.com/office/word/2016/wordml/cid" xmlns:w16="http://schemas.microsoft.com/office/word/2018/wordml" xmlns:w16se="http://schemas.microsoft.com/office/word/2015/wordml/symex" mc:Ignorable="w14 w15 w16se w16cid w16 w16cex">
+<w:styles xmlns:mc="http://schemas.openxmlformats.org/markup-compatibility/2006" xmlns:r="http://schemas.openxmlformats.org/officeDocument/2006/relationships" xmlns:w="http://schemas.openxmlformats.org/wordprocessingml/2006/main" xmlns:w14="http://schemas.microsoft.com/office/word/2010/wordml" xmlns:w15="http://schemas.microsoft.com/office/word/2012/wordml" xmlns:w16cex="http://schemas.microsoft.com/office/word/2018/wordml/cex" xmlns:w16cid="http://schemas.microsoft.com/office/word/2016/wordml/cid" xmlns:w16="http://schemas.microsoft.com/office/word/2018/wordml" xmlns:w16sdtdh="http://schemas.microsoft.com/office/word/2020/wordml/sdtdatahash" xmlns:w16se="http://schemas.microsoft.com/office/word/2015/wordml/symex" mc:Ignorable="w14 w15 w16se w16cid w16 w16cex w16sdtdh">
   <w:docDefaults>
     <w:rPrDefault>
       <w:rPr>
@@ -2045,6 +2130,27 @@
       <w:szCs w:val="32"/>
     </w:rPr>
   </w:style>
+  <w:style w:type="paragraph" w:styleId="Heading3">
+    <w:name w:val="heading 3"/>
+    <w:basedOn w:val="Normal"/>
+    <w:next w:val="Normal"/>
+    <w:link w:val="Heading3Char"/>
+    <w:uiPriority w:val="9"/>
+    <w:semiHidden/>
+    <w:unhideWhenUsed/>
+    <w:qFormat/>
+    <w:rsid w:val="00E76AB3"/>
+    <w:pPr>
+      <w:keepNext/>
+      <w:keepLines/>
+      <w:spacing w:before="40"/>
+      <w:outlineLvl w:val="2"/>
+    </w:pPr>
+    <w:rPr>
+      <w:rFonts w:asciiTheme="majorHAnsi" w:eastAsiaTheme="majorEastAsia" w:hAnsiTheme="majorHAnsi" w:cstheme="majorBidi"/>
+      <w:color w:val="1F3763" w:themeColor="accent1" w:themeShade="7F"/>
+    </w:rPr>
+  </w:style>
   <w:style w:type="character" w:default="1" w:styleId="DefaultParagraphFont">
     <w:name w:val="Default Paragraph Font"/>
     <w:uiPriority w:val="1"/>
@@ -2202,6 +2308,67 @@
       <w:rFonts w:ascii="Times New Roman" w:hAnsi="Times New Roman" w:cs="Times New Roman"/>
       <w:sz w:val="18"/>
       <w:szCs w:val="18"/>
+    </w:rPr>
+  </w:style>
+  <w:style w:type="character" w:customStyle="1" w:styleId="Heading3Char">
+    <w:name w:val="Heading 3 Char"/>
+    <w:basedOn w:val="DefaultParagraphFont"/>
+    <w:link w:val="Heading3"/>
+    <w:uiPriority w:val="9"/>
+    <w:semiHidden/>
+    <w:rsid w:val="00E76AB3"/>
+    <w:rPr>
+      <w:rFonts w:asciiTheme="majorHAnsi" w:eastAsiaTheme="majorEastAsia" w:hAnsiTheme="majorHAnsi" w:cstheme="majorBidi"/>
+      <w:color w:val="1F3763" w:themeColor="accent1" w:themeShade="7F"/>
+    </w:rPr>
+  </w:style>
+  <w:style w:type="paragraph" w:styleId="HTMLPreformatted">
+    <w:name w:val="HTML Preformatted"/>
+    <w:basedOn w:val="Normal"/>
+    <w:link w:val="HTMLPreformattedChar"/>
+    <w:uiPriority w:val="99"/>
+    <w:semiHidden/>
+    <w:unhideWhenUsed/>
+    <w:rsid w:val="00E76AB3"/>
+    <w:pPr>
+      <w:tabs>
+        <w:tab w:val="left" w:pos="916"/>
+        <w:tab w:val="left" w:pos="1832"/>
+        <w:tab w:val="left" w:pos="2748"/>
+        <w:tab w:val="left" w:pos="3664"/>
+        <w:tab w:val="left" w:pos="4580"/>
+        <w:tab w:val="left" w:pos="5496"/>
+        <w:tab w:val="left" w:pos="6412"/>
+        <w:tab w:val="left" w:pos="7328"/>
+        <w:tab w:val="left" w:pos="8244"/>
+        <w:tab w:val="left" w:pos="9160"/>
+        <w:tab w:val="left" w:pos="10076"/>
+        <w:tab w:val="left" w:pos="10992"/>
+        <w:tab w:val="left" w:pos="11908"/>
+        <w:tab w:val="left" w:pos="12824"/>
+        <w:tab w:val="left" w:pos="13740"/>
+        <w:tab w:val="left" w:pos="14656"/>
+      </w:tabs>
+    </w:pPr>
+    <w:rPr>
+      <w:rFonts w:ascii="Courier New" w:eastAsia="Times New Roman" w:hAnsi="Courier New" w:cs="Courier New"/>
+      <w:sz w:val="20"/>
+      <w:szCs w:val="20"/>
+      <w:lang w:eastAsia="en-GB"/>
+    </w:rPr>
+  </w:style>
+  <w:style w:type="character" w:customStyle="1" w:styleId="HTMLPreformattedChar">
+    <w:name w:val="HTML Preformatted Char"/>
+    <w:basedOn w:val="DefaultParagraphFont"/>
+    <w:link w:val="HTMLPreformatted"/>
+    <w:uiPriority w:val="99"/>
+    <w:semiHidden/>
+    <w:rsid w:val="00E76AB3"/>
+    <w:rPr>
+      <w:rFonts w:ascii="Courier New" w:eastAsia="Times New Roman" w:hAnsi="Courier New" w:cs="Courier New"/>
+      <w:sz w:val="20"/>
+      <w:szCs w:val="20"/>
+      <w:lang w:eastAsia="en-GB"/>
     </w:rPr>
   </w:style>
 </w:styles>

</xml_diff>